<commit_message>
Add Code and Data Availability section with GitHub repo link (RU+EN)
</commit_message>
<xml_diff>
--- a/manuscript/manuscript_EP6AB.docx
+++ b/manuscript/manuscript_EP6AB.docx
@@ -3711,6 +3711,39 @@
           <w:lang w:val="ru-RU" w:eastAsia="ru-RU"/>
         </w:rPr>
         <w:t>Результат строгий и в целом негативный. Для данной задачи активационная дельта не превосходит TF-IDF по исходному тексту, не реагирует на переопределяющую обёртку при контроле контента, а её кажущаяся «сигнатура переопределения» объясняется различиями источника. Единственный устойчивый (robust) результат — устойчивость к избыточной защите — оказывается свойством распределения данных, а не метода. Это полезное ограничение семейства методов: оно предостерегает от заявлений об «обнаружении переопределения» на основе дельты, которую превосходит простой текстовый базовый метод.</w:t>
+      </w:r>
+    </w:p>
+    <w:p>
+      <w:pPr>
+        <w:spacing w:line="360" w:lineRule="auto" w:after="80" w:before="200"/>
+        <w:jc w:val="left"/>
+      </w:pPr>
+      <w:r>
+        <w:rPr>
+          <w:rFonts w:ascii="Times New Roman" w:hAnsi="Times New Roman" w:cs="Times New Roman" w:eastAsia="Times New Roman"/>
+          <w:b/>
+          <w:i w:val="0"/>
+          <w:sz w:val="24"/>
+          <w:lang w:val="ru-RU" w:eastAsia="ru-RU"/>
+        </w:rPr>
+        <w:t>Доступность данных и кода</w:t>
+      </w:r>
+    </w:p>
+    <w:p>
+      <w:pPr>
+        <w:spacing w:line="360" w:lineRule="auto" w:after="0" w:before="0"/>
+        <w:ind w:firstLine="283"/>
+        <w:jc w:val="both"/>
+      </w:pPr>
+      <w:r>
+        <w:rPr>
+          <w:rFonts w:ascii="Times New Roman" w:hAnsi="Times New Roman" w:cs="Times New Roman" w:eastAsia="Times New Roman"/>
+          <w:b w:val="0"/>
+          <w:i w:val="0"/>
+          <w:sz w:val="22"/>
+          <w:lang w:val="ru-RU" w:eastAsia="ru-RU"/>
+        </w:rPr>
+        <w:t>Полный воспроизводимый пакет — замороженный датасет, скрипты пайплайна (T0–T5 и проверка масштаба), рисунки, отчёты и рукопись — доступен в репозитории: https://github.com/in40/10.17605-OSF.IO-EP6AB (CC0). Предрегистрация: OSF ep6ab, DOI 10.17605/OSF.IO/EP6AB.</w:t>
       </w:r>
     </w:p>
     <w:p>
@@ -8708,6 +8741,39 @@
           <w:sz w:val="24"/>
           <w:lang w:val="en-US" w:eastAsia="en-US"/>
         </w:rPr>
+        <w:t>Code and Data Availability</w:t>
+      </w:r>
+    </w:p>
+    <w:p>
+      <w:pPr>
+        <w:spacing w:line="360" w:lineRule="auto" w:after="0" w:before="0"/>
+        <w:ind w:firstLine="283"/>
+        <w:jc w:val="both"/>
+      </w:pPr>
+      <w:r>
+        <w:rPr>
+          <w:rFonts w:ascii="Times New Roman" w:hAnsi="Times New Roman" w:cs="Times New Roman" w:eastAsia="Times New Roman"/>
+          <w:b w:val="0"/>
+          <w:i w:val="0"/>
+          <w:sz w:val="22"/>
+          <w:lang w:val="en-US" w:eastAsia="en-US"/>
+        </w:rPr>
+        <w:t>The complete reproducible package — frozen dataset, pipeline scripts (T0–T5 and the model-scale check), figures, reports, and the manuscript — is available at https://github.com/in40/10.17605-OSF.IO-EP6AB (CC0). Pre-registration: OSF ep6ab, DOI 10.17605/OSF.IO/EP6AB.</w:t>
+      </w:r>
+    </w:p>
+    <w:p>
+      <w:pPr>
+        <w:spacing w:line="360" w:lineRule="auto" w:after="80" w:before="200"/>
+        <w:jc w:val="left"/>
+      </w:pPr>
+      <w:r>
+        <w:rPr>
+          <w:rFonts w:ascii="Times New Roman" w:hAnsi="Times New Roman" w:cs="Times New Roman" w:eastAsia="Times New Roman"/>
+          <w:b/>
+          <w:i w:val="0"/>
+          <w:sz w:val="24"/>
+          <w:lang w:val="en-US" w:eastAsia="en-US"/>
+        </w:rPr>
         <w:t>Glossary</w:t>
       </w:r>
     </w:p>

</xml_diff>